<commit_message>
Upgrade MCP server to v2.0 with 21 semantic tools, resources, and prompts
The single run_command tool required the AI to know exact CLI syntax.
Now 16 typed tools (add_aperture, set_bay, set_walls, etc.) let the AI
call parameters directly. run_command kept as escape hatch. Also adds
3 MCP resources (state://current, snapshots://list, help://commands)
and 2 prompt templates (design_review, aperture_audit). Updated README
and MANUAL.docx Section 14 + quick-ref table to document all changes.
MCP package upgraded from 1.9.1 to 1.26.0.

Co-Authored-By: Claude Opus 4.6 <noreply@anthropic.com>
</commit_message>
<xml_diff>
--- a/layout-jig/MANUAL.docx
+++ b/layout-jig/MANUAL.docx
@@ -7145,12 +7145,12 @@
         <w:pStyle w:val="Heading1"/>
       </w:pPr>
       <w:r>
-        <w:t xml:space="preserve">14  MCP Server</w:t>
-      </w:r>
-    </w:p>
-    <w:p>
-      <w:r>
-        <w:t xml:space="preserve">The MCP (Model Context Protocol) server wraps the CLI so that AI assistants like Claude Desktop or Cursor can drive the jig conversationally over stdio. This is the one component that requires an external package.</w:t>
+        <w:t>14  MCP Server</w:t>
+      </w:r>
+    </w:p>
+    <w:p>
+      <w:r>
+        <w:t>The MCP (Model Context Protocol) server wraps the CLI so that AI assistants can drive the jig conversationally. Version 2.0 adds 16 semantic tools with typed parameters, MCP resources, and prompt templates. The AI calls add_aperture(bay="A", id="d1", type="door", ...) instead of guessing raw CLI syntax.</w:t>
       </w:r>
     </w:p>
     <w:p>
@@ -7158,12 +7158,12 @@
         <w:pStyle w:val="Heading2"/>
       </w:pPr>
       <w:r>
-        <w:t xml:space="preserve">14.1  Setup</w:t>
-      </w:r>
-    </w:p>
-    <w:p>
-      <w:r>
-        <w:t xml:space="preserve">Install the MCP package:</w:t>
+        <w:t>14.1  Setup</w:t>
+      </w:r>
+    </w:p>
+    <w:p>
+      <w:r>
+        <w:t>Install the MCP package (v1.26.0 or later):</w:t>
       </w:r>
     </w:p>
     <w:p>
@@ -7173,17 +7173,17 @@
     </w:p>
     <w:p>
       <w:r>
-        <w:t xml:space="preserve">Configure Claude Desktop by adding an entry to claude_desktop_config.json:</w:t>
-      </w:r>
-    </w:p>
-    <w:p>
-      <w:r>
-        <w:t xml:space="preserve">  { "mcpServers": { "layout-jig": { "command": "python", "args": ["path/to/mcp_server.py", "--state", "path/to/state.json"] } } }</w:t>
-      </w:r>
-    </w:p>
-    <w:p>
-      <w:r>
-        <w:t xml:space="preserve">Or set the environment variable LAYOUT_JIG_STATE and omit --state.</w:t>
+        <w:t>For Claude Code, place .mcp.json at the project root:</w:t>
+      </w:r>
+    </w:p>
+    <w:p>
+      <w:r>
+        <w:t xml:space="preserve">  { "mcpServers": { "layout-jig": { "command": "python", "args": ["Layout Jig/layout-jig/mcp_server.py", "--state", "Layout Jig/layout-jig/state.json"] } } }</w:t>
+      </w:r>
+    </w:p>
+    <w:p>
+      <w:r>
+        <w:t>For Claude Desktop, add the same entry to claude_desktop_config.json. Or set the environment variable LAYOUT_JIG_STATE and omit --state.</w:t>
       </w:r>
     </w:p>
     <w:p>
@@ -7191,37 +7191,53 @@
         <w:pStyle w:val="Heading2"/>
       </w:pPr>
       <w:r>
-        <w:t xml:space="preserve">14.2  Available Tools</w:t>
-      </w:r>
-    </w:p>
-    <w:p>
-      <w:r>
-        <w:t xml:space="preserve">The server exposes five MCP tools:</w:t>
-      </w:r>
-    </w:p>
-    <w:p>
-      <w:r>
-        <w:t xml:space="preserve">run_command(command) — Execute any CLI command. Returns the same OK:/ERROR: messages the terminal prints.</w:t>
-      </w:r>
-    </w:p>
-    <w:p>
-      <w:r>
-        <w:t xml:space="preserve">describe() — Full text model description.</w:t>
-      </w:r>
-    </w:p>
-    <w:p>
-      <w:r>
-        <w:t xml:space="preserve">list_bays() — Compact bay table.</w:t>
-      </w:r>
-    </w:p>
-    <w:p>
-      <w:r>
-        <w:t xml:space="preserve">get_state() — Raw JSON contents of the state file.</w:t>
-      </w:r>
-    </w:p>
-    <w:p>
-      <w:r>
-        <w:t xml:space="preserve">get_help() — Full command reference text.</w:t>
+        <w:t>14.2  Available Tools</w:t>
+      </w:r>
+    </w:p>
+    <w:p>
+      <w:r>
+        <w:t>The server exposes 21 tools in five categories. All semantic tools are thin wrappers that construct CLI command strings internally, so validation and error messages are identical to the terminal.</w:t>
+      </w:r>
+    </w:p>
+    <w:p>
+      <w:r>
+        <w:t>Read tools (no state mutation): describe(), list_bays(), get_state(), get_help(), list_apertures(bay), list_cells(bay), list_rooms(), list_snapshots().</w:t>
+      </w:r>
+    </w:p>
+    <w:p>
+      <w:r>
+        <w:t>Bay configuration: set_bay(bay, field, value) sets any bay property. The field parameter accepts: origin, rotation, bays, spacing, spacing_x, spacing_y, grid_type, z_order, void_center, void_size, void_shape, label, braille, rings, ring_spacing, arms, arc_deg, arc_start_deg.</w:t>
+      </w:r>
+    </w:p>
+    <w:p>
+      <w:r>
+        <w:t>Walls and corridors: set_walls(bay, enabled, thickness) toggles walls on/off with optional thickness. set_corridor(bay, enabled, field, value) toggles corridors and optionally sets axis, position, width, loading, hatch, or hatch_scale.</w:t>
+      </w:r>
+    </w:p>
+    <w:p>
+      <w:r>
+        <w:t>Apertures: add_aperture(bay, id, type, axis, gridline, corner, width, height) adds a door, window, or portal. remove_aperture(bay, id) removes one. modify_aperture(bay, id, field, value) changes any property: type, axis, gridline, corner, width, height, hinge, swing.</w:t>
+      </w:r>
+    </w:p>
+    <w:p>
+      <w:r>
+        <w:t>Cells and rooms: set_cell(bay, col, row, field, value) sets a cell's name, label, braille, hatch, hatch_scale, or hatch_rotation. auto_corridor_cells(bay) detects and labels corridor-zone cells.</w:t>
+      </w:r>
+    </w:p>
+    <w:p>
+      <w:pPr/>
+      <w:r>
+        <w:t>Site and style: set_site(field, value) sets width or height. set_style(field, value) sets any of: heavy, light, corridor, wall, text_height, braille_height, dash_len, gap_len, bg_pad, label_offset, arc_segments.</w:t>
+      </w:r>
+    </w:p>
+    <w:p>
+      <w:r>
+        <w:t>Snapshots: save_snapshot(name) checkpoints the current state. load_snapshot(name) restores it. Use snapshots before significant changes since undo is not available in MCP mode.</w:t>
+      </w:r>
+    </w:p>
+    <w:p>
+      <w:r>
+        <w:t>Escape hatch: run_command(command) executes any raw CLI command string. Use this for advanced operations not covered by the semantic tools.</w:t>
       </w:r>
     </w:p>
     <w:p>
@@ -7229,12 +7245,38 @@
         <w:pStyle w:val="Heading2"/>
       </w:pPr>
       <w:r>
-        <w:t xml:space="preserve">14.3  Design Notes</w:t>
-      </w:r>
-    </w:p>
-    <w:p>
-      <w:r>
-        <w:t xml:space="preserve">Each tool call loads state from disk, runs the command, and saves back. There is no persistent session, so undo is not available in MCP mode. The server returns an error suggesting named snapshots (Section 13.2) instead.</w:t>
+        <w:t>14.3  MCP Resources</w:t>
+      </w:r>
+    </w:p>
+    <w:p>
+      <w:r>
+        <w:t xml:space="preserve">Three read-only resources let the AI load context without calling a tool: state://current returns the full JSON state, snapshots://list shows available checkpoints, and help://commands provides the CLI reference.</w:t>
+      </w:r>
+    </w:p>
+    <w:p>
+      <w:pPr>
+        <w:pStyle w:val="Heading2"/>
+      </w:pPr>
+      <w:r>
+        <w:t xml:space="preserve">14.4  MCP Prompts</w:t>
+      </w:r>
+    </w:p>
+    <w:p>
+      <w:r>
+        <w:t xml:space="preserve">Two prompt templates are registered: design_review loads the full model description and asks for spatial, circulation, and tactile feedback. aperture_audit lists all apertures across all bays and checks for missing doors, window placement, and portal sizing.</w:t>
+      </w:r>
+    </w:p>
+    <w:p>
+      <w:pPr>
+        <w:pStyle w:val="Heading2"/>
+      </w:pPr>
+      <w:r>
+        <w:t xml:space="preserve">14.5  Design Notes</w:t>
+      </w:r>
+    </w:p>
+    <w:p>
+      <w:r>
+        <w:t xml:space="preserve">Each tool call loads state from disk, runs the command, and saves back. There is no persistent session, so undo is not available. Use named snapshots to checkpoint before major changes.</w:t>
       </w:r>
     </w:p>
     <w:p>
@@ -7242,11 +7284,7 @@
         <w:t xml:space="preserve">Stdout is reserved for JSON-RPC transport. All print output from the controller is redirected to stderr.</w:t>
       </w:r>
     </w:p>
-    <w:p>
-      <w:r>
-        <w:t xml:space="preserve"/>
-      </w:r>
-    </w:p>
+    <w:p/>
     <w:p>
       <w:pPr>
         <w:pStyle w:val="Heading1"/>
@@ -17361,21 +17399,21 @@
       <w:tr>
         <w:tc>
           <w:tcPr>
-            <w:tcW w:type="dxa" w:w="4680"/>
-          </w:tcPr>
-          <w:p>
-            <w:r>
-              <w:t>run_command(command)</w:t>
-            </w:r>
-          </w:p>
-        </w:tc>
-        <w:tc>
-          <w:tcPr>
-            <w:tcW w:type="dxa" w:w="4680"/>
-          </w:tcPr>
-          <w:p>
-            <w:r>
-              <w:t>Execute any CLI command</w:t>
+            <w:tcW w:w="4680" w:type="dxa"/>
+          </w:tcPr>
+          <w:p>
+            <w:r>
+              <w:t xml:space="preserve">describe()</w:t>
+            </w:r>
+          </w:p>
+        </w:tc>
+        <w:tc>
+          <w:tcPr>
+            <w:tcW w:w="4680" w:type="dxa"/>
+          </w:tcPr>
+          <w:p>
+            <w:r>
+              <w:t xml:space="preserve">Full model description</w:t>
             </w:r>
           </w:p>
         </w:tc>
@@ -17383,21 +17421,21 @@
       <w:tr>
         <w:tc>
           <w:tcPr>
-            <w:tcW w:type="dxa" w:w="4680"/>
-          </w:tcPr>
-          <w:p>
-            <w:r>
-              <w:t>describe()</w:t>
-            </w:r>
-          </w:p>
-        </w:tc>
-        <w:tc>
-          <w:tcPr>
-            <w:tcW w:type="dxa" w:w="4680"/>
-          </w:tcPr>
-          <w:p>
-            <w:r>
-              <w:t>Full model description</w:t>
+            <w:tcW w:w="4680" w:type="dxa"/>
+          </w:tcPr>
+          <w:p>
+            <w:r>
+              <w:t xml:space="preserve">list_bays()</w:t>
+            </w:r>
+          </w:p>
+        </w:tc>
+        <w:tc>
+          <w:tcPr>
+            <w:tcW w:w="4680" w:type="dxa"/>
+          </w:tcPr>
+          <w:p>
+            <w:r>
+              <w:t xml:space="preserve">Compact bay table</w:t>
             </w:r>
           </w:p>
         </w:tc>
@@ -17405,21 +17443,21 @@
       <w:tr>
         <w:tc>
           <w:tcPr>
-            <w:tcW w:type="dxa" w:w="4680"/>
-          </w:tcPr>
-          <w:p>
-            <w:r>
-              <w:t>list_bays()</w:t>
-            </w:r>
-          </w:p>
-        </w:tc>
-        <w:tc>
-          <w:tcPr>
-            <w:tcW w:type="dxa" w:w="4680"/>
-          </w:tcPr>
-          <w:p>
-            <w:r>
-              <w:t>Compact bay table</w:t>
+            <w:tcW w:w="4680" w:type="dxa"/>
+          </w:tcPr>
+          <w:p>
+            <w:r>
+              <w:t xml:space="preserve">get_state()</w:t>
+            </w:r>
+          </w:p>
+        </w:tc>
+        <w:tc>
+          <w:tcPr>
+            <w:tcW w:w="4680" w:type="dxa"/>
+          </w:tcPr>
+          <w:p>
+            <w:r>
+              <w:t xml:space="preserve">Raw JSON state</w:t>
             </w:r>
           </w:p>
         </w:tc>
@@ -17427,21 +17465,21 @@
       <w:tr>
         <w:tc>
           <w:tcPr>
-            <w:tcW w:type="dxa" w:w="4680"/>
-          </w:tcPr>
-          <w:p>
-            <w:r>
-              <w:t>get_state()</w:t>
-            </w:r>
-          </w:p>
-        </w:tc>
-        <w:tc>
-          <w:tcPr>
-            <w:tcW w:type="dxa" w:w="4680"/>
-          </w:tcPr>
-          <w:p>
-            <w:r>
-              <w:t>Raw JSON state</w:t>
+            <w:tcW w:w="4680" w:type="dxa"/>
+          </w:tcPr>
+          <w:p>
+            <w:r>
+              <w:t xml:space="preserve">get_help()</w:t>
+            </w:r>
+          </w:p>
+        </w:tc>
+        <w:tc>
+          <w:tcPr>
+            <w:tcW w:w="4680" w:type="dxa"/>
+          </w:tcPr>
+          <w:p>
+            <w:r>
+              <w:t xml:space="preserve">Command reference text</w:t>
             </w:r>
           </w:p>
         </w:tc>
@@ -17449,21 +17487,373 @@
       <w:tr>
         <w:tc>
           <w:tcPr>
-            <w:tcW w:type="dxa" w:w="4680"/>
-          </w:tcPr>
-          <w:p>
-            <w:r>
-              <w:t>get_help()</w:t>
-            </w:r>
-          </w:p>
-        </w:tc>
-        <w:tc>
-          <w:tcPr>
-            <w:tcW w:type="dxa" w:w="4680"/>
-          </w:tcPr>
-          <w:p>
-            <w:r>
-              <w:t>Command reference text</w:t>
+            <w:tcW w:w="4680" w:type="dxa"/>
+          </w:tcPr>
+          <w:p>
+            <w:r>
+              <w:t xml:space="preserve">list_apertures(bay)</w:t>
+            </w:r>
+          </w:p>
+        </w:tc>
+        <w:tc>
+          <w:tcPr>
+            <w:tcW w:w="4680" w:type="dxa"/>
+          </w:tcPr>
+          <w:p>
+            <w:r>
+              <w:t xml:space="preserve">All apertures for a bay</w:t>
+            </w:r>
+          </w:p>
+        </w:tc>
+      </w:tr>
+      <w:tr>
+        <w:tc>
+          <w:tcPr>
+            <w:tcW w:w="4680" w:type="dxa"/>
+          </w:tcPr>
+          <w:p>
+            <w:r>
+              <w:t xml:space="preserve">list_cells(bay)</w:t>
+            </w:r>
+          </w:p>
+        </w:tc>
+        <w:tc>
+          <w:tcPr>
+            <w:tcW w:w="4680" w:type="dxa"/>
+          </w:tcPr>
+          <w:p>
+            <w:r>
+              <w:t xml:space="preserve">Cell grid with names and areas</w:t>
+            </w:r>
+          </w:p>
+        </w:tc>
+      </w:tr>
+      <w:tr>
+        <w:tc>
+          <w:tcPr>
+            <w:tcW w:w="4680" w:type="dxa"/>
+          </w:tcPr>
+          <w:p>
+            <w:r>
+              <w:t xml:space="preserve">list_rooms()</w:t>
+            </w:r>
+          </w:p>
+        </w:tc>
+        <w:tc>
+          <w:tcPr>
+            <w:tcW w:w="4680" w:type="dxa"/>
+          </w:tcPr>
+          <w:p>
+            <w:r>
+              <w:t xml:space="preserve">All named rooms</w:t>
+            </w:r>
+          </w:p>
+        </w:tc>
+      </w:tr>
+      <w:tr>
+        <w:tc>
+          <w:tcPr>
+            <w:tcW w:w="4680" w:type="dxa"/>
+          </w:tcPr>
+          <w:p>
+            <w:r>
+              <w:t xml:space="preserve">list_snapshots()</w:t>
+            </w:r>
+          </w:p>
+        </w:tc>
+        <w:tc>
+          <w:tcPr>
+            <w:tcW w:w="4680" w:type="dxa"/>
+          </w:tcPr>
+          <w:p>
+            <w:r>
+              <w:t xml:space="preserve">Available named snapshots</w:t>
+            </w:r>
+          </w:p>
+        </w:tc>
+      </w:tr>
+      <w:tr>
+        <w:tc>
+          <w:tcPr>
+            <w:tcW w:w="4680" w:type="dxa"/>
+          </w:tcPr>
+          <w:p>
+            <w:r>
+              <w:t xml:space="preserve">set_bay(bay, field, value)</w:t>
+            </w:r>
+          </w:p>
+        </w:tc>
+        <w:tc>
+          <w:tcPr>
+            <w:tcW w:w="4680" w:type="dxa"/>
+          </w:tcPr>
+          <w:p>
+            <w:r>
+              <w:t xml:space="preserve">Set any bay property</w:t>
+            </w:r>
+          </w:p>
+        </w:tc>
+      </w:tr>
+      <w:tr>
+        <w:tc>
+          <w:tcPr>
+            <w:tcW w:w="4680" w:type="dxa"/>
+          </w:tcPr>
+          <w:p>
+            <w:r>
+              <w:t xml:space="preserve">set_walls(bay, enabled, thickness)</w:t>
+            </w:r>
+          </w:p>
+        </w:tc>
+        <w:tc>
+          <w:tcPr>
+            <w:tcW w:w="4680" w:type="dxa"/>
+          </w:tcPr>
+          <w:p>
+            <w:r>
+              <w:t xml:space="preserve">Toggle walls, set thickness</w:t>
+            </w:r>
+          </w:p>
+        </w:tc>
+      </w:tr>
+      <w:tr>
+        <w:tc>
+          <w:tcPr>
+            <w:tcW w:w="4680" w:type="dxa"/>
+          </w:tcPr>
+          <w:p>
+            <w:r>
+              <w:t xml:space="preserve">set_corridor(bay, enabled, field, value)</w:t>
+            </w:r>
+          </w:p>
+        </w:tc>
+        <w:tc>
+          <w:tcPr>
+            <w:tcW w:w="4680" w:type="dxa"/>
+          </w:tcPr>
+          <w:p>
+            <w:r>
+              <w:t xml:space="preserve">Toggle corridor, set properties</w:t>
+            </w:r>
+          </w:p>
+        </w:tc>
+      </w:tr>
+      <w:tr>
+        <w:tc>
+          <w:tcPr>
+            <w:tcW w:w="4680" w:type="dxa"/>
+          </w:tcPr>
+          <w:p>
+            <w:r>
+              <w:t xml:space="preserve">add_aperture(bay, id, type, axis, gridline, corner, width, height)</w:t>
+            </w:r>
+          </w:p>
+        </w:tc>
+        <w:tc>
+          <w:tcPr>
+            <w:tcW w:w="4680" w:type="dxa"/>
+          </w:tcPr>
+          <w:p>
+            <w:r>
+              <w:t xml:space="preserve">Add door, window, or portal</w:t>
+            </w:r>
+          </w:p>
+        </w:tc>
+      </w:tr>
+      <w:tr>
+        <w:tc>
+          <w:tcPr>
+            <w:tcW w:w="4680" w:type="dxa"/>
+          </w:tcPr>
+          <w:p>
+            <w:r>
+              <w:t xml:space="preserve">remove_aperture(bay, id)</w:t>
+            </w:r>
+          </w:p>
+        </w:tc>
+        <w:tc>
+          <w:tcPr>
+            <w:tcW w:w="4680" w:type="dxa"/>
+          </w:tcPr>
+          <w:p>
+            <w:r>
+              <w:t xml:space="preserve">Remove an aperture</w:t>
+            </w:r>
+          </w:p>
+        </w:tc>
+      </w:tr>
+      <w:tr>
+        <w:tc>
+          <w:tcPr>
+            <w:tcW w:w="4680" w:type="dxa"/>
+          </w:tcPr>
+          <w:p>
+            <w:r>
+              <w:t xml:space="preserve">modify_aperture(bay, id, field, value)</w:t>
+            </w:r>
+          </w:p>
+        </w:tc>
+        <w:tc>
+          <w:tcPr>
+            <w:tcW w:w="4680" w:type="dxa"/>
+          </w:tcPr>
+          <w:p>
+            <w:r>
+              <w:t xml:space="preserve">Change aperture property</w:t>
+            </w:r>
+          </w:p>
+        </w:tc>
+      </w:tr>
+      <w:tr>
+        <w:tc>
+          <w:tcPr>
+            <w:tcW w:w="4680" w:type="dxa"/>
+          </w:tcPr>
+          <w:p>
+            <w:r>
+              <w:t xml:space="preserve">set_cell(bay, col, row, field, value)</w:t>
+            </w:r>
+          </w:p>
+        </w:tc>
+        <w:tc>
+          <w:tcPr>
+            <w:tcW w:w="4680" w:type="dxa"/>
+          </w:tcPr>
+          <w:p>
+            <w:r>
+              <w:t xml:space="preserve">Set cell name, label, hatch</w:t>
+            </w:r>
+          </w:p>
+        </w:tc>
+      </w:tr>
+      <w:tr>
+        <w:tc>
+          <w:tcPr>
+            <w:tcW w:w="4680" w:type="dxa"/>
+          </w:tcPr>
+          <w:p>
+            <w:r>
+              <w:t xml:space="preserve">auto_corridor_cells(bay)</w:t>
+            </w:r>
+          </w:p>
+        </w:tc>
+        <w:tc>
+          <w:tcPr>
+            <w:tcW w:w="4680" w:type="dxa"/>
+          </w:tcPr>
+          <w:p>
+            <w:r>
+              <w:t xml:space="preserve">Auto-name corridor cells</w:t>
+            </w:r>
+          </w:p>
+        </w:tc>
+      </w:tr>
+      <w:tr>
+        <w:tc>
+          <w:tcPr>
+            <w:tcW w:w="4680" w:type="dxa"/>
+          </w:tcPr>
+          <w:p>
+            <w:r>
+              <w:t xml:space="preserve">set_site(field, value)</w:t>
+            </w:r>
+          </w:p>
+        </w:tc>
+        <w:tc>
+          <w:tcPr>
+            <w:tcW w:w="4680" w:type="dxa"/>
+          </w:tcPr>
+          <w:p>
+            <w:r>
+              <w:t xml:space="preserve">Set site width or height</w:t>
+            </w:r>
+          </w:p>
+        </w:tc>
+      </w:tr>
+      <w:tr>
+        <w:tc>
+          <w:tcPr>
+            <w:tcW w:w="4680" w:type="dxa"/>
+          </w:tcPr>
+          <w:p>
+            <w:r>
+              <w:t xml:space="preserve">set_style(field, value)</w:t>
+            </w:r>
+          </w:p>
+        </w:tc>
+        <w:tc>
+          <w:tcPr>
+            <w:tcW w:w="4680" w:type="dxa"/>
+          </w:tcPr>
+          <w:p>
+            <w:r>
+              <w:t xml:space="preserve">Set drawing style parameter</w:t>
+            </w:r>
+          </w:p>
+        </w:tc>
+      </w:tr>
+      <w:tr>
+        <w:tc>
+          <w:tcPr>
+            <w:tcW w:w="4680" w:type="dxa"/>
+          </w:tcPr>
+          <w:p>
+            <w:r>
+              <w:t xml:space="preserve">save_snapshot(name)</w:t>
+            </w:r>
+          </w:p>
+        </w:tc>
+        <w:tc>
+          <w:tcPr>
+            <w:tcW w:w="4680" w:type="dxa"/>
+          </w:tcPr>
+          <w:p>
+            <w:r>
+              <w:t xml:space="preserve">Checkpoint current state</w:t>
+            </w:r>
+          </w:p>
+        </w:tc>
+      </w:tr>
+      <w:tr>
+        <w:tc>
+          <w:tcPr>
+            <w:tcW w:w="4680" w:type="dxa"/>
+          </w:tcPr>
+          <w:p>
+            <w:r>
+              <w:t xml:space="preserve">load_snapshot(name)</w:t>
+            </w:r>
+          </w:p>
+        </w:tc>
+        <w:tc>
+          <w:tcPr>
+            <w:tcW w:w="4680" w:type="dxa"/>
+          </w:tcPr>
+          <w:p>
+            <w:r>
+              <w:t xml:space="preserve">Restore a snapshot</w:t>
+            </w:r>
+          </w:p>
+        </w:tc>
+      </w:tr>
+      <w:tr>
+        <w:tc>
+          <w:tcPr>
+            <w:tcW w:w="4680" w:type="dxa"/>
+          </w:tcPr>
+          <w:p>
+            <w:r>
+              <w:t xml:space="preserve">run_command(command)</w:t>
+            </w:r>
+          </w:p>
+        </w:tc>
+        <w:tc>
+          <w:tcPr>
+            <w:tcW w:w="4680" w:type="dxa"/>
+          </w:tcPr>
+          <w:p>
+            <w:r>
+              <w:t xml:space="preserve">Execute raw CLI command (escape hatch)</w:t>
             </w:r>
           </w:p>
         </w:tc>

</xml_diff>